<commit_message>
Changed sentence in third clause
</commit_message>
<xml_diff>
--- a/contract_files/models/Contrato Compra e Venda de Imovel -  Matricula.docx
+++ b/contract_files/models/Contrato Compra e Venda de Imovel -  Matricula.docx
@@ -667,6 +667,15 @@
           <w:lang w:val="pt-BR"/>
         </w:rPr>
       </w:r>
+      <w:r>
+        <w:rPr>
+          <w:b w:val="0"/>
+          <w:bCs w:val="0"/>
+          <w:sz w:val="22"/>
+          <w:szCs w:val="22"/>
+          <w:lang w:val="pt-BR"/>
+        </w:rPr>
+      </w:r>
     </w:p>
     <w:p>
       <w:pPr>
@@ -888,6 +897,15 @@
           <w:lang w:val="pt-BR"/>
         </w:rPr>
       </w:r>
+      <w:r>
+        <w:rPr>
+          <w:b w:val="0"/>
+          <w:bCs w:val="0"/>
+          <w:sz w:val="22"/>
+          <w:szCs w:val="22"/>
+          <w:lang w:val="pt-BR"/>
+        </w:rPr>
+      </w:r>
     </w:p>
     <w:p>
       <w:pPr>
@@ -1116,7 +1134,7 @@
           <w:szCs w:val="22"/>
           <w:lang w:val="pt-BR"/>
         </w:rPr>
-        <w:t xml:space="preserve">, o(a) COMPRADOR(A) pagará ao(à) VENDEDOR(A) o valor total de </w:t>
+        <w:t xml:space="preserve">, o(a) COMPRADOR(A) pagará ao(à) VENDEDOR(A) o valor de </w:t>
       </w:r>
       <w:r>
         <w:rPr>
@@ -1167,7 +1185,15 @@
           <w:szCs w:val="22"/>
           <w:lang w:val="pt-BR" w:bidi="pt-BR"/>
         </w:rPr>
-        <w:t xml:space="preserve">O pagamento será realizado de forma parcelada, a título de entrada/sinal, R$ _____________ , mais a entrega de pela entrega de ________________________________________________, avaliado(a) em R$ _____________, recebido(a) como parte do pagamento,  e o saldo</w:t>
+        <w:t xml:space="preserve">O</w:t>
+      </w:r>
+      <w:r>
+        <w:rPr>
+          <w:sz w:val="22"/>
+          <w:szCs w:val="22"/>
+          <w:lang w:val="pt-BR" w:bidi="pt-BR"/>
+        </w:rPr>
+        <w:t xml:space="preserve"> pagamento será realizado de forma parcelada, a título de entrada/sinal, R$ _____________ , mais a entrega de pela entrega de ________________________________________________, avaliado(a) em R$ _____________, recebido(a) como parte do pagamento,  e o saldo</w:t>
       </w:r>
       <w:r>
         <w:rPr>
@@ -1176,65 +1202,6 @@
           <w:lang w:val="pt-BR" w:bidi="pt-BR"/>
         </w:rPr>
         <w:t xml:space="preserve"> remanescente de R$ ________________, será pago em _______ parcelas de R$ ________________, vencendo a primeira em ________________, e as demais no mesmo dia dos meses subsequentes.</w:t>
-      </w:r>
-      <w:r>
-        <w:rPr>
-          <w:sz w:val="22"/>
-          <w:szCs w:val="22"/>
-          <w:lang w:val="pt-BR" w:bidi="pt-BR"/>
-        </w:rPr>
-      </w:r>
-      <w:r>
-        <w:rPr>
-          <w:sz w:val="22"/>
-          <w:szCs w:val="22"/>
-          <w:lang w:val="pt-BR"/>
-        </w:rPr>
-      </w:r>
-      <w:r>
-        <w:rPr>
-          <w:sz w:val="22"/>
-          <w:szCs w:val="22"/>
-          <w:lang w:val="pt-BR"/>
-        </w:rPr>
-      </w:r>
-      <w:r>
-        <w:rPr>
-          <w:sz w:val="22"/>
-          <w:szCs w:val="22"/>
-          <w:lang w:val="pt-BR"/>
-        </w:rPr>
-      </w:r>
-      <w:r>
-        <w:rPr>
-          <w:sz w:val="22"/>
-          <w:szCs w:val="22"/>
-          <w:lang w:val="pt-BR"/>
-        </w:rPr>
-      </w:r>
-      <w:r>
-        <w:rPr>
-          <w:sz w:val="22"/>
-          <w:szCs w:val="22"/>
-          <w:highlight w:val="none"/>
-          <w:lang w:val="pt-BR"/>
-        </w:rPr>
-      </w:r>
-      <w:r>
-        <w:rPr>
-          <w:sz w:val="22"/>
-          <w:szCs w:val="22"/>
-          <w:highlight w:val="none"/>
-          <w:lang w:val="pt-BR" w:bidi="pt-BR"/>
-        </w:rPr>
-      </w:r>
-      <w:r>
-        <w:rPr>
-          <w:sz w:val="22"/>
-          <w:szCs w:val="22"/>
-          <w:highlight w:val="none"/>
-          <w:lang w:val="pt-BR" w:bidi="pt-BR"/>
-        </w:rPr>
       </w:r>
       <w:r>
         <w:rPr>

</xml_diff>

<commit_message>
Changed pagination in footer
</commit_message>
<xml_diff>
--- a/contract_files/models/Contrato Compra e Venda de Imovel -  Matricula.docx
+++ b/contract_files/models/Contrato Compra e Venda de Imovel -  Matricula.docx
@@ -3283,6 +3283,7 @@
         <w:rPr>
           <w:sz w:val="22"/>
           <w:szCs w:val="22"/>
+          <w:highlight w:val="none"/>
           <w:lang w:val="pt-BR"/>
         </w:rPr>
       </w:pPr>
@@ -3501,7 +3502,20 @@
       <w:rPr>
         <w:lang w:val="pt-BR"/>
       </w:rPr>
-      <w:t xml:space="preserve"> de 4</w:t>
+      <w:t xml:space="preserve"> de </w:t>
+    </w:r>
+    <w:fldSimple w:instr="NUMPAGES \* MERGEFORMAT">
+      <w:r>
+        <w:rPr>
+          <w:lang w:val="pt-BR"/>
+        </w:rPr>
+        <w:t xml:space="preserve">1</w:t>
+      </w:r>
+    </w:fldSimple>
+    <w:r>
+      <w:rPr>
+        <w:lang w:val="pt-BR"/>
+      </w:rPr>
     </w:r>
     <w:r/>
   </w:p>

</xml_diff>